<commit_message>
Settings for the vectorization / RAG . Removed the automatic RAG background process that was eating up all resources. Now it is a manual process.
</commit_message>
<xml_diff>
--- a/Specs/Functional/Canvas/Semantic Graph Canvas.docx
+++ b/Specs/Functional/Canvas/Semantic Graph Canvas.docx
@@ -169,7 +169,19 @@
     </w:p>
     <w:p>
       <w:r>
-        <w:t>There are several “general” actions that can be performed on the canvas or on domains:</w:t>
+        <w:t xml:space="preserve">There are several </w:t>
+      </w:r>
+      <w:r>
+        <w:t>“investigations” (</w:t>
+      </w:r>
+      <w:r>
+        <w:t>general actions</w:t>
+      </w:r>
+      <w:r>
+        <w:t>)</w:t>
+      </w:r>
+      <w:r>
+        <w:t xml:space="preserve"> that can be performed on the canvas or on domains:</w:t>
       </w:r>
     </w:p>
     <w:p>
@@ -182,6 +194,30 @@
       </w:pPr>
       <w:r>
         <w:t>Discover link: this will let the LLM analyze the things and try to find links between the things.</w:t>
+      </w:r>
+    </w:p>
+    <w:p>
+      <w:pPr>
+        <w:pStyle w:val="Paragraphedeliste"/>
+        <w:numPr>
+          <w:ilvl w:val="0"/>
+          <w:numId w:val="1"/>
+        </w:numPr>
+      </w:pPr>
+      <w:r>
+        <w:t>Evaluate risk: this will build a risk matrix. Each risk will be linked to the thing or the fragment of the thing that constitutes a risk</w:t>
+      </w:r>
+    </w:p>
+    <w:p>
+      <w:pPr>
+        <w:pStyle w:val="Paragraphedeliste"/>
+        <w:numPr>
+          <w:ilvl w:val="0"/>
+          <w:numId w:val="1"/>
+        </w:numPr>
+      </w:pPr>
+      <w:r>
+        <w:t>SWOT: this will build a SWOT: Each argument (Strength, weakness, opportunity or threat) will be linked to the things or fragments of things that support the argument.</w:t>
       </w:r>
     </w:p>
     <w:p>

</xml_diff>